<commit_message>
Mejora en el servicio de extracción de datos de CV. Se implementa limpieza de caracteres nulos en PDFs, normalización de texto para correos y teléfonos, y se añaden nuevas estrategias para extraer RUT y fechas de nacimiento. Se actualiza la documentación de funciones para reflejar estos cambios.
</commit_message>
<xml_diff>
--- a/Backend/temp_cvs/cv_ejemplo2.docx
+++ b/Backend/temp_cvs/cv_ejemplo2.docx
@@ -17,6 +17,11 @@
         <w:t>mzurita@email.com | +56 9 9599 9153 | Santiago, Chile</w:t>
       </w:r>
     </w:p>
+    <w:p>
+      <w:r>
+        <w:t>19856987-8</w:t>
+      </w:r>
+    </w:p>
     <w:p/>
     <w:p>
       <w:r>
@@ -70,6 +75,7 @@
     <w:p/>
     <w:p>
       <w:r>
+        <w:lastRenderedPageBreak/>
         <w:t>01/2017 - 08/2018, Analista Programador, Servicios Tecnológicos Innovadores, Santiago</w:t>
       </w:r>
     </w:p>
@@ -165,6 +171,7 @@
     </w:p>
     <w:p>
       <w:r>
+        <w:lastRenderedPageBreak/>
         <w:t>Resolución de problemas</w:t>
       </w:r>
     </w:p>
@@ -175,7 +182,6 @@
     </w:p>
     <w:p>
       <w:r>
-        <w:lastRenderedPageBreak/>
         <w:t>Atención al detalle</w:t>
       </w:r>
     </w:p>

</xml_diff>